<commit_message>
Correct WRRA-M 0.6 shared lattice and global twist record magnitude
Use the 0.6 lattice for state loads and transport, preserve calibration provenance, and verify 64/128 cross-input regressions. Refresh matched KO/EN manuscripts and reproducibility package while retaining reference outputs. Prepare Zenodo version 0.6-r2.
</commit_message>
<xml_diff>
--- a/paper/WRRA_M_0_6_EN.docx
+++ b/paper/WRRA_M_0_6_EN.docx
@@ -36,7 +36,7 @@
         <w:br/>
       </w:r>
       <w:r>
-        <w:t xml:space="preserve">WRRA-M 0.6 | 1 October 2026</w:t>
+        <w:t>WRRA-M 0.6-r2 | 1 October 2026</w:t>
       </w:r>
       <w:r>
         <w:br/>
@@ -344,6 +344,17 @@
       </w:pPr>
       <w:r>
         <w:t xml:space="preserve">A periodic cycle Laplacian on N=128 sites is the clustering operator. The background operator starts from the same Laplacian and adds a positive rank-one term only for the noncommuting test. The denominator maintains background load 2 in the uniform state.</w:t>
+      </w:r>
+    </w:p>
+    <w:p>
+      <w:pPr>
+        <w:pStyle w:val="FirstParagraph"/>
+        <w:keepNext/>
+        <w:ind w:firstLine="0"/>
+        <w:jc w:val="left"/>
+      </w:pPr>
+      <w:r>
+        <w:t>Version 0.6 lattice_N controls the common grid for information loads and the transport carrier test. The original 0.5 input is retained as calibration provenance; the shared value is applied only to a private copy for the carrier calculation. The result lattice_contract discloses the configured and effective sizes. Cross-input tests at 64/128 and 128/64 confirm matching grids and unchanged uniform reference outputs.</w:t>
       </w:r>
     </w:p>
     <w:p>
@@ -5389,7 +5400,7 @@
         <w:jc w:val="left"/>
       </w:pPr>
       <w:r>
-        <w:t xml:space="preserve">For the uniform reference with nc=0 and nb=3, expansion and accumulated record are</w:t>
+        <w:t>For the uniform reference with nc=0 and nb=3, expansion and global twist record magnitude are</w:t>
       </w:r>
     </w:p>
     <w:p>
@@ -6377,7 +6388,7 @@
         <w:jc w:val="left"/>
       </w:pPr>
       <w:r>
-        <w:t xml:space="preserve">Physical twist rate and accumulated record evolve differently. Beyond the present, the accumulated record can grow during expansion while the density-dependent physical twist rate declines. They are not combined into one scalar twist statement. The variable a is geometric scale; it is not automatically replaced by observed redshift before a twist photon-redshift kernel is derived.</w:t>
+        <w:t>Physical twist rate and global twist record magnitude evolve differently. The record magnitude is an aggregate computed from the load density and spatial size at the current state and scale; no independent law of temporal record accumulation has been calculated. Beyond the present, this global record magnitude can grow during expansion while the density-dependent physical twist rate declines. They are not combined into one scalar twist statement. The variable a is geometric scale; it is not automatically replaced by observed redshift before a twist photon-redshift kernel is derived.</w:t>
       </w:r>
     </w:p>
     <w:p>

</xml_diff>